<commit_message>
feat: Relatório Parcial 1
</commit_message>
<xml_diff>
--- a/reports/Relatorio_Vila_Aurora_Parcial1.docx
+++ b/reports/Relatorio_Vila_Aurora_Parcial1.docx
@@ -3,32 +3,54 @@
 <w:document xmlns:wpc="http://schemas.microsoft.com/office/word/2010/wordprocessingCanvas" xmlns:cx="http://schemas.microsoft.com/office/drawing/2014/chartex" xmlns:cx1="http://schemas.microsoft.com/office/drawing/2015/9/8/chartex" xmlns:cx2="http://schemas.microsoft.com/office/drawing/2015/10/21/chartex" xmlns:cx3="http://schemas.microsoft.com/office/drawing/2016/5/9/chartex" xmlns:cx4="http://schemas.microsoft.com/office/drawing/2016/5/10/chartex" xmlns:cx5="http://schemas.microsoft.com/office/drawing/2016/5/11/chartex" xmlns:cx6="http://schemas.microsoft.com/office/drawing/2016/5/12/chartex" xmlns:cx7="http://schemas.microsoft.com/office/drawing/2016/5/13/chartex" xmlns:cx8="http://schemas.microsoft.com/office/drawing/2016/5/14/chartex" xmlns:mc="http://schemas.openxmlformats.org/markup-compatibility/2006" xmlns:aink="http://schemas.microsoft.com/office/drawing/2016/ink" xmlns:am3d="http://schemas.microsoft.com/office/drawing/2017/model3d" xmlns:o="urn:schemas-microsoft-com:office:office" xmlns:oel="http://schemas.microsoft.com/office/2019/extlst" xmlns:r="http://schemas.openxmlformats.org/officeDocument/2006/relationships" xmlns:m="http://schemas.openxmlformats.org/officeDocument/2006/math" xmlns:v="urn:schemas-microsoft-com:vml" xmlns:wp14="http://schemas.microsoft.com/office/word/2010/wordprocessingDrawing" xmlns:wp="http://schemas.openxmlformats.org/drawingml/2006/wordprocessingDrawing" xmlns:w10="urn:schemas-microsoft-com:office:word" xmlns:w="http://schemas.openxmlformats.org/wordprocessingml/2006/main" xmlns:w14="http://schemas.microsoft.com/office/word/2010/wordml" xmlns:w15="http://schemas.microsoft.com/office/word/2012/wordml" xmlns:w16cex="http://schemas.microsoft.com/office/word/2018/wordml/cex" xmlns:w16cid="http://schemas.microsoft.com/office/word/2016/wordml/cid" xmlns:w16="http://schemas.microsoft.com/office/word/2018/wordml" xmlns:w16du="http://schemas.microsoft.com/office/word/2023/wordml/word16du" xmlns:w16sdtdh="http://schemas.microsoft.com/office/word/2020/wordml/sdtdatahash" xmlns:w16sdtfl="http://schemas.microsoft.com/office/word/2024/wordml/sdtformatlock" xmlns:w16se="http://schemas.microsoft.com/office/word/2015/wordml/symex" xmlns:wpg="http://schemas.microsoft.com/office/word/2010/wordprocessingGroup" xmlns:wpi="http://schemas.microsoft.com/office/word/2010/wordprocessingInk" xmlns:wne="http://schemas.microsoft.com/office/word/2006/wordml" xmlns:wps="http://schemas.microsoft.com/office/word/2010/wordprocessingShape" mc:Ignorable="w14 w15 w16se w16cid w16 w16cex w16sdtdh w16sdtfl w16du wp14">
   <w:body>
     <w:p>
+      <w:pPr>
+        <w:rPr>
+          <w:lang w:val="pt-BR"/>
+        </w:rPr>
+      </w:pPr>
       <w:r>
         <w:rPr>
           <w:b/>
           <w:sz w:val="20"/>
+          <w:lang w:val="pt-BR"/>
         </w:rPr>
         <w:t>ENG4550 — Projeto Integrado em Sistemas Produtivos (PI5)</w:t>
       </w:r>
     </w:p>
     <w:p>
+      <w:pPr>
+        <w:rPr>
+          <w:lang w:val="pt-BR"/>
+        </w:rPr>
+      </w:pPr>
       <w:r>
         <w:rPr>
           <w:sz w:val="20"/>
+          <w:lang w:val="pt-BR"/>
         </w:rPr>
         <w:t>Departamento de Engenharia Industrial — PUC-Rio   |   Professor: Rodrigo Caiado</w:t>
       </w:r>
     </w:p>
-    <w:p/>
+    <w:p>
+      <w:pPr>
+        <w:rPr>
+          <w:lang w:val="pt-BR"/>
+        </w:rPr>
+      </w:pPr>
+    </w:p>
     <w:p>
       <w:pPr>
         <w:jc w:val="center"/>
+        <w:rPr>
+          <w:lang w:val="pt-BR"/>
+        </w:rPr>
       </w:pPr>
       <w:r>
         <w:rPr>
           <w:b/>
           <w:color w:val="1E4682"/>
           <w:sz w:val="36"/>
+          <w:lang w:val="pt-BR"/>
         </w:rPr>
         <w:t>Vila Aurora Alimentos &amp; Mercearia S.A.</w:t>
       </w:r>
@@ -36,57 +58,123 @@
     <w:p>
       <w:pPr>
         <w:jc w:val="center"/>
+        <w:rPr>
+          <w:lang w:val="pt-BR"/>
+        </w:rPr>
       </w:pPr>
       <w:r>
         <w:rPr>
           <w:i/>
           <w:sz w:val="24"/>
+          <w:lang w:val="pt-BR"/>
         </w:rPr>
         <w:t>Do Caos à Orquestração — Transformando Previsão, Estoques e Execução no Varejo Tradicional</w:t>
       </w:r>
     </w:p>
-    <w:p/>
+    <w:p>
+      <w:pPr>
+        <w:rPr>
+          <w:lang w:val="pt-BR"/>
+        </w:rPr>
+      </w:pPr>
+    </w:p>
     <w:p>
       <w:pPr>
         <w:jc w:val="center"/>
+        <w:rPr>
+          <w:lang w:val="pt-BR"/>
+        </w:rPr>
       </w:pPr>
       <w:r>
         <w:rPr>
           <w:b/>
           <w:sz w:val="26"/>
-        </w:rPr>
-        <w:t>Relatório Parcial 1 — Blocos 1 e 2 (Questões Q1 a Q9)</w:t>
+          <w:lang w:val="pt-BR"/>
+        </w:rPr>
+        <w:t>Relatório Parcial 1 — Blocos 1</w:t>
+      </w:r>
+      <w:r>
+        <w:rPr>
+          <w:b/>
+          <w:sz w:val="26"/>
+          <w:lang w:val="pt-BR"/>
+        </w:rPr>
+        <w:t xml:space="preserve">, </w:t>
+      </w:r>
+      <w:r>
+        <w:rPr>
+          <w:b/>
+          <w:sz w:val="26"/>
+          <w:lang w:val="pt-BR"/>
+        </w:rPr>
+        <w:t xml:space="preserve">2 </w:t>
+      </w:r>
+      <w:r>
+        <w:rPr>
+          <w:b/>
+          <w:sz w:val="26"/>
+          <w:lang w:val="pt-BR"/>
+        </w:rPr>
+        <w:t xml:space="preserve">e 3 </w:t>
+      </w:r>
+      <w:r>
+        <w:rPr>
+          <w:b/>
+          <w:sz w:val="26"/>
+          <w:lang w:val="pt-BR"/>
+        </w:rPr>
+        <w:t>(Questões Q1 a Q9)</w:t>
       </w:r>
     </w:p>
     <w:p>
       <w:pPr>
         <w:jc w:val="center"/>
+        <w:rPr>
+          <w:lang w:val="pt-BR"/>
+        </w:rPr>
       </w:pPr>
       <w:r>
         <w:rPr>
           <w:i/>
           <w:color w:val="505050"/>
+          <w:lang w:val="pt-BR"/>
         </w:rPr>
         <w:t>Cenário em análise: Lead Time Instável em Congelados + Choque Promocional em Premium</w:t>
       </w:r>
     </w:p>
-    <w:p/>
+    <w:p>
+      <w:pPr>
+        <w:rPr>
+          <w:lang w:val="pt-BR"/>
+        </w:rPr>
+      </w:pPr>
+    </w:p>
     <w:p>
       <w:pPr>
         <w:jc w:val="center"/>
+        <w:rPr>
+          <w:lang w:val="pt-BR"/>
+        </w:rPr>
       </w:pPr>
       <w:r>
+        <w:rPr>
+          <w:lang w:val="pt-BR"/>
+        </w:rPr>
         <w:t>João Almeida  •  Lucas Agostinho  •  Gabriel Stadler  •  Felipe Sarmento</w:t>
       </w:r>
     </w:p>
     <w:p>
       <w:pPr>
         <w:jc w:val="center"/>
+        <w:rPr>
+          <w:lang w:val="pt-BR"/>
+        </w:rPr>
       </w:pPr>
       <w:r>
         <w:rPr>
           <w:i/>
           <w:sz w:val="20"/>
+          <w:lang w:val="pt-BR"/>
         </w:rPr>
         <w:t>Abril de 2026</w:t>
       </w:r>
@@ -94,12 +182,16 @@
     <w:p>
       <w:pPr>
         <w:spacing w:before="280" w:after="120"/>
+        <w:rPr>
+          <w:lang w:val="pt-BR"/>
+        </w:rPr>
       </w:pPr>
       <w:r>
         <w:rPr>
           <w:b/>
           <w:color w:val="1E4682"/>
           <w:sz w:val="32"/>
+          <w:lang w:val="pt-BR"/>
         </w:rPr>
         <w:t>Q1. Visão PCP 5.0</w:t>
       </w:r>
@@ -108,8 +200,14 @@
       <w:pPr>
         <w:spacing w:after="120"/>
         <w:jc w:val="both"/>
+        <w:rPr>
+          <w:lang w:val="pt-BR"/>
+        </w:rPr>
       </w:pPr>
       <w:r>
+        <w:rPr>
+          <w:lang w:val="pt-BR"/>
+        </w:rPr>
         <w:t>A Vila Aurora opera hoje em um ciclo reativo: previsão baseada em média simples dos últimos três meses, políticas de estoque de duas semanas fixas aplicadas a todas as famílias, e ausência de rotina estruturada de S&amp;OE. Esse arranjo já seria problemático em regime normal, mas o cenário em análise impõe dois choques simultâneos — aumento de 50% no lead time de F4 (Congelados) por oito semanas a partir da semana 30, e promoção de F2 (Premium) com +55% de demanda na mesma semana. O modelo atual não absorve choques simultâneos de oferta e demanda em famílias distintas.</w:t>
       </w:r>
     </w:p>
@@ -117,8 +215,14 @@
       <w:pPr>
         <w:spacing w:after="120"/>
         <w:jc w:val="both"/>
+        <w:rPr>
+          <w:lang w:val="pt-BR"/>
+        </w:rPr>
       </w:pPr>
       <w:r>
+        <w:rPr>
+          <w:lang w:val="pt-BR"/>
+        </w:rPr>
         <w:t>A transformação para PCP 5.0 deve ocorrer em três camadas complementares. Na camada de digitalização, corrigir lacunas de cadastro (12% dos SKUs sem EAN), integrar e-commerce em tempo real e implementar modelos de previsão diferenciados por perfil de demanda — smooth, erratic ou com sazonalidade explícita. Na camada de sustentabilidade, incorporar custo de descarte e emissões de CO₂ diretamente na função objetivo das políticas de estoque; o limite de 15 viagens emergenciais por mês força proatividade, e o descarte crônico de 4,5% em F1 (estimado em R$ 38 mil/mês segundo o P8 do diagnóstico interno) exige lotes calibrados pelo shelf life. Na camada human-centric, instituir rotina semanal de S&amp;OE com gatilhos quantitativos, decisores nomeados e dashboard de semáforos, explicitando o que é automatizável e o que exige julgamento humano.</w:t>
       </w:r>
     </w:p>
@@ -126,20 +230,30 @@
       <w:pPr>
         <w:spacing w:after="120"/>
         <w:jc w:val="both"/>
+        <w:rPr>
+          <w:lang w:val="pt-BR"/>
+        </w:rPr>
       </w:pPr>
       <w:r>
+        <w:rPr>
+          <w:lang w:val="pt-BR"/>
+        </w:rPr>
         <w:t>O estado-alvo é um sistema integrado e adaptável, onde previsão diferenciada alimenta políticas específicas por família, simulações antecipam choques e S&amp;OE estruturado resolve trade-offs com critérios explícitos — tema aprofundado em Q7 e nos blocos seguintes.</w:t>
       </w:r>
     </w:p>
     <w:p>
       <w:pPr>
         <w:spacing w:before="280" w:after="120"/>
+        <w:rPr>
+          <w:lang w:val="pt-BR"/>
+        </w:rPr>
       </w:pPr>
       <w:r>
         <w:rPr>
           <w:b/>
           <w:color w:val="1E4682"/>
           <w:sz w:val="32"/>
+          <w:lang w:val="pt-BR"/>
         </w:rPr>
         <w:t>Q2. KPIs Estratégicos</w:t>
       </w:r>
@@ -148,8 +262,14 @@
       <w:pPr>
         <w:spacing w:after="120"/>
         <w:jc w:val="both"/>
+        <w:rPr>
+          <w:lang w:val="pt-BR"/>
+        </w:rPr>
       </w:pPr>
       <w:r>
+        <w:rPr>
+          <w:lang w:val="pt-BR"/>
+        </w:rPr>
         <w:t>Propomos três KPIs não negociáveis, um para cada dimensão crítica — serviço, custo/eficiência e ESG — formando o triângulo que orientará todas as decisões de PCP.</w:t>
       </w:r>
     </w:p>
@@ -526,9 +646,15 @@
             <w:vAlign w:val="center"/>
           </w:tcPr>
           <w:p>
-            <w:r>
-              <w:rPr>
-                <w:sz w:val="19"/>
+            <w:pPr>
+              <w:rPr>
+                <w:lang w:val="pt-BR"/>
+              </w:rPr>
+            </w:pPr>
+            <w:r>
+              <w:rPr>
+                <w:sz w:val="19"/>
+                <w:lang w:val="pt-BR"/>
               </w:rPr>
               <w:t>4,5% em F1  •  14,2 viagens/mês (pico 21)</w:t>
             </w:r>
@@ -539,20 +665,30 @@
     <w:p>
       <w:pPr>
         <w:spacing w:after="80"/>
+        <w:rPr>
+          <w:lang w:val="pt-BR"/>
+        </w:rPr>
       </w:pPr>
     </w:p>
     <w:p>
       <w:pPr>
         <w:spacing w:after="120"/>
         <w:jc w:val="both"/>
+        <w:rPr>
+          <w:lang w:val="pt-BR"/>
+        </w:rPr>
       </w:pPr>
       <w:r>
         <w:rPr>
           <w:b/>
+          <w:lang w:val="pt-BR"/>
         </w:rPr>
         <w:t xml:space="preserve">KPI 1 — Fill Rate Ponderado por Canal (≥ 97%). </w:t>
       </w:r>
       <w:r>
+        <w:rPr>
+          <w:lang w:val="pt-BR"/>
+        </w:rPr>
         <w:t>O fill rate simples mascara dinâmicas: a loja física opera próxima a 94%, mas o e-commerce fica em ~88% (com 6% de cancelamento por indisponibilidade). Ponderar pelos pesos de mix (loja 70%, e-commerce 15%, marketplace 10%, retira 5%) alinha a métrica ao KPI do cliente final. A meta de 97% vem do benchmark de varejo premium.</w:t>
       </w:r>
     </w:p>
@@ -560,14 +696,21 @@
       <w:pPr>
         <w:spacing w:after="120"/>
         <w:jc w:val="both"/>
+        <w:rPr>
+          <w:lang w:val="pt-BR"/>
+        </w:rPr>
       </w:pPr>
       <w:r>
         <w:rPr>
           <w:b/>
+          <w:lang w:val="pt-BR"/>
         </w:rPr>
         <w:t xml:space="preserve">KPI 2 — Custo Logístico / Receita (≤ 6,5%). </w:t>
       </w:r>
       <w:r>
+        <w:rPr>
+          <w:lang w:val="pt-BR"/>
+        </w:rPr>
         <w:t>Soma de custos de pedido, armazenagem, ruptura, descarte e viagens extras sobre receita líquida. Normaliza comparação entre períodos. Meta de 6,5% representa redução de ~20% sobre o baseline atual.</w:t>
       </w:r>
     </w:p>
@@ -575,14 +718,21 @@
       <w:pPr>
         <w:spacing w:after="120"/>
         <w:jc w:val="both"/>
+        <w:rPr>
+          <w:lang w:val="pt-BR"/>
+        </w:rPr>
       </w:pPr>
       <w:r>
         <w:rPr>
           <w:b/>
+          <w:lang w:val="pt-BR"/>
         </w:rPr>
         <w:t xml:space="preserve">KPI 3 — Índice Desperdício Zero. </w:t>
       </w:r>
       <w:r>
+        <w:rPr>
+          <w:lang w:val="pt-BR"/>
+        </w:rPr>
         <w:t>Índice composto de descarte percentual (em valor) e número de viagens emergenciais mensais (proxy direto de CO₂). Cada viagem emergencial custa R$ 1.250 e emite 42 kg de CO₂. A combinação das duas métricas evita o efeito perverso de reduzir descarte aumentando o número de entregas emergenciais.</w:t>
       </w:r>
     </w:p>
@@ -590,26 +740,37 @@
       <w:pPr>
         <w:spacing w:after="120"/>
         <w:jc w:val="both"/>
+        <w:rPr>
+          <w:lang w:val="pt-BR"/>
+        </w:rPr>
       </w:pPr>
       <w:r>
         <w:rPr>
           <w:b/>
+          <w:lang w:val="pt-BR"/>
         </w:rPr>
         <w:t xml:space="preserve">Triângulo de ferro. </w:t>
       </w:r>
       <w:r>
+        <w:rPr>
+          <w:lang w:val="pt-BR"/>
+        </w:rPr>
         <w:t>Os três KPIs são acoplados: elevar fill rate exige mais estoque de segurança, o que eleva custo e descarte; reduzir viagens pode comprometer fill rate se não houver compensação via previsão melhor. O papel do PCP é encontrar o equilíbrio, e as simulações Monte Carlo do Bloco 4 mapearão a fronteira eficiente entre essas três dimensões.</w:t>
       </w:r>
     </w:p>
     <w:p>
       <w:pPr>
         <w:spacing w:before="280" w:after="120"/>
+        <w:rPr>
+          <w:lang w:val="pt-BR"/>
+        </w:rPr>
       </w:pPr>
       <w:r>
         <w:rPr>
           <w:b/>
           <w:color w:val="1E4682"/>
           <w:sz w:val="32"/>
+          <w:lang w:val="pt-BR"/>
         </w:rPr>
         <w:t>Q3. Granularidade de Análise</w:t>
       </w:r>
@@ -618,8 +779,14 @@
       <w:pPr>
         <w:spacing w:after="120"/>
         <w:jc w:val="both"/>
+        <w:rPr>
+          <w:lang w:val="pt-BR"/>
+        </w:rPr>
       </w:pPr>
       <w:r>
+        <w:rPr>
+          <w:lang w:val="pt-BR"/>
+        </w:rPr>
         <w:t>Adotamos família de produtos como granularidade principal, com desagregação hierárquica top-down para SKU via shares do Anexo A2. A previsão ocorre sobre a série agregada (104 semanas por família, Anexo D1); a alocação por SKU respeita restrições de lote e shelf life.</w:t>
       </w:r>
     </w:p>
@@ -627,20 +794,42 @@
       <w:pPr>
         <w:spacing w:after="120"/>
         <w:jc w:val="both"/>
+        <w:rPr>
+          <w:lang w:val="pt-BR"/>
+        </w:rPr>
       </w:pPr>
       <w:r>
-        <w:t>A escolha preserva sinal em séries de menor variabilidade: o coeficiente de variação estrutural reportado no Anexo A é F1 = 12%, F2 = 47%, F3 = 10%, F4 = 25%, F5 = 55% (valores que representam a variabilidade líquida após remover sazonalidade e tendência). A CV realizada na série agregada é sistematicamente maior — F1 = 22%, F2 = 62%, F3 = 15%, F4 = 35%, F5 = 62% — porque inclui estrutura e eventos exógenos. Essa distinção é importante porque os modelos trabalham com a série observada, não com o CV estrutural. Dentro de cada família, a variabilidade relativa entre SKUs é suficientemente baixa (coeficiente relativo entre 0,7 e 1,3) para que a agregação não distorça; análise por canal é tratada como alocação pós-previsão, não como granularidade paralela.</w:t>
+        <w:rPr>
+          <w:lang w:val="pt-BR"/>
+        </w:rPr>
+        <w:t>A escolha preserva sinal em séries de menor variabilidade: o coeficiente de variação estrutural reportado no Anexo A é F1 = 12%, F2 = 47%, F3 = 10%, F4 = 25%, F5 = 55% (valores que representam a variabilidade líquida após remover sazonalidade e tendência). A CV realizada na série agregada é sistematicamente maior — F1 = 22%, F2 = 62%, F3 = 15%, F4 = 35%, F5 = 62% — porque inclui estrutura e eventos exógenos. Essa distinção é importante porque os modelos trabalham com a série observada, não com o CV estrutural. Dentro de cada família, a variabilidade relativa entre SKUs é suficientemente baixa (coeficiente relativo entre 0,7 e 1,3) para que a agregação não distorça</w:t>
+      </w:r>
+      <w:r>
+        <w:rPr>
+          <w:lang w:val="pt-BR"/>
+        </w:rPr>
+        <w:t>,</w:t>
+      </w:r>
+      <w:r>
+        <w:rPr>
+          <w:lang w:val="pt-BR"/>
+        </w:rPr>
+        <w:t xml:space="preserve"> análise por canal é tratada como alocação pós-previsão, não como granularidade paralela.</w:t>
       </w:r>
     </w:p>
     <w:p>
       <w:pPr>
         <w:spacing w:before="280" w:after="120"/>
+        <w:rPr>
+          <w:lang w:val="pt-BR"/>
+        </w:rPr>
       </w:pPr>
       <w:r>
         <w:rPr>
           <w:b/>
           <w:color w:val="1E4682"/>
           <w:sz w:val="32"/>
+          <w:lang w:val="pt-BR"/>
         </w:rPr>
         <w:t>Q4. Benchmarking Inicial de Modelos</w:t>
       </w:r>
@@ -649,14 +838,21 @@
       <w:pPr>
         <w:spacing w:after="120"/>
         <w:jc w:val="both"/>
+        <w:rPr>
+          <w:lang w:val="pt-BR"/>
+        </w:rPr>
       </w:pPr>
       <w:r>
         <w:rPr>
           <w:b/>
+          <w:lang w:val="pt-BR"/>
         </w:rPr>
         <w:t xml:space="preserve">SKUs contrastantes. </w:t>
       </w:r>
       <w:r>
+        <w:rPr>
+          <w:lang w:val="pt-BR"/>
+        </w:rPr>
         <w:t>F1-001 (Leite Integral 1L): 984 un/semana, CV = 23%, shelf life 7 dias, perfil smooth. F2-003 (Vinho Reserva 750ml): 68 un/semana, CV = 63%, shelf life 730 dias, perfil erratic.</w:t>
       </w:r>
     </w:p>
@@ -668,11 +864,72 @@
       <w:r>
         <w:rPr>
           <w:b/>
+          <w:lang w:val="pt-BR"/>
         </w:rPr>
         <w:t xml:space="preserve">Metodologia. </w:t>
       </w:r>
       <w:r>
-        <w:t>Split temporal: 80 semanas de treino (1-80), 24 semanas de teste (81-104). Modelos comparados: Naive, SES (α otimizado por MLE), Holt linear (α, β otimizados) e Holt-Winters aditivo com sazonalidade anual (seasonal_periods=52, inicialização 'known' com priors neutros, parâmetros α, β, γ otimizados). Implementação em statsmodels; script completo em src/q4_benchmarking_sku.py no repositório.</w:t>
+        <w:rPr>
+          <w:lang w:val="pt-BR"/>
+        </w:rPr>
+        <w:t>Split temporal: 80 semanas de treino (1-80), 24 semanas de teste (81-104). Modelos comparados: Naive, SES (</w:t>
+      </w:r>
+      <w:r>
+        <w:t>α</w:t>
+      </w:r>
+      <w:r>
+        <w:rPr>
+          <w:lang w:val="pt-BR"/>
+        </w:rPr>
+        <w:t xml:space="preserve"> otimizado por MLE), Holt linear (</w:t>
+      </w:r>
+      <w:r>
+        <w:t>α</w:t>
+      </w:r>
+      <w:r>
+        <w:rPr>
+          <w:lang w:val="pt-BR"/>
+        </w:rPr>
+        <w:t xml:space="preserve">, </w:t>
+      </w:r>
+      <w:r>
+        <w:t>β</w:t>
+      </w:r>
+      <w:r>
+        <w:rPr>
+          <w:lang w:val="pt-BR"/>
+        </w:rPr>
+        <w:t xml:space="preserve"> otimizados) e Holt-Winters aditivo com sazonalidade anual (seasonal_periods=52, inicialização 'known' com priors neutros, parâmetros </w:t>
+      </w:r>
+      <w:r>
+        <w:t>α</w:t>
+      </w:r>
+      <w:r>
+        <w:rPr>
+          <w:lang w:val="pt-BR"/>
+        </w:rPr>
+        <w:t xml:space="preserve">, </w:t>
+      </w:r>
+      <w:r>
+        <w:t>β</w:t>
+      </w:r>
+      <w:r>
+        <w:rPr>
+          <w:lang w:val="pt-BR"/>
+        </w:rPr>
+        <w:t xml:space="preserve">, </w:t>
+      </w:r>
+      <w:r>
+        <w:t>γ</w:t>
+      </w:r>
+      <w:r>
+        <w:rPr>
+          <w:lang w:val="pt-BR"/>
+        </w:rPr>
+        <w:t xml:space="preserve"> otimizados). </w:t>
+      </w:r>
+      <w:r>
+        <w:t>Implementação em statsmodels; script completo em src/q4_benchmarking_sku.py no repositório.</w:t>
       </w:r>
     </w:p>
     <w:tbl>
@@ -1697,12 +1954,16 @@
       <w:pPr>
         <w:spacing w:after="160"/>
         <w:jc w:val="center"/>
+        <w:rPr>
+          <w:lang w:val="pt-BR"/>
+        </w:rPr>
       </w:pPr>
       <w:r>
         <w:rPr>
           <w:i/>
           <w:color w:val="5A5A5A"/>
           <w:sz w:val="18"/>
+          <w:lang w:val="pt-BR"/>
         </w:rPr>
         <w:t>Figura 1 — Séries temporais com previsões no período de teste (topo) e RMSE comparativo por modelo (base). Esquerda: F1-001 (smooth). Direita: F2-003 (erratic).</w:t>
       </w:r>
@@ -1711,14 +1972,21 @@
       <w:pPr>
         <w:spacing w:after="120"/>
         <w:jc w:val="both"/>
+        <w:rPr>
+          <w:lang w:val="pt-BR"/>
+        </w:rPr>
       </w:pPr>
       <w:r>
         <w:rPr>
           <w:b/>
+          <w:lang w:val="pt-BR"/>
         </w:rPr>
         <w:t xml:space="preserve">F1-001: Holt-Winters vencedor. </w:t>
       </w:r>
       <w:r>
+        <w:rPr>
+          <w:lang w:val="pt-BR"/>
+        </w:rPr>
         <w:t>Reduz MAE em 16% e RMSE em 8% sobre o Naive, com MAPE 18,2%. O ganho decorre da captura de sazonalidade intra-anual — visível no gráfico, onde H-W acompanha as oscilações enquanto os demais modelos se estabilizam em um patamar plano.</w:t>
       </w:r>
     </w:p>
@@ -1726,14 +1994,21 @@
       <w:pPr>
         <w:spacing w:after="120"/>
         <w:jc w:val="both"/>
+        <w:rPr>
+          <w:lang w:val="pt-BR"/>
+        </w:rPr>
       </w:pPr>
       <w:r>
         <w:rPr>
           <w:b/>
+          <w:lang w:val="pt-BR"/>
         </w:rPr>
         <w:t xml:space="preserve">F2-003: complexidade não ajuda. </w:t>
       </w:r>
       <w:r>
+        <w:rPr>
+          <w:lang w:val="pt-BR"/>
+        </w:rPr>
         <w:t>Os quatro modelos produzem RMSE praticamente idênticos (entre 38,3 e 40,0), e todos apresentam MAPE próximo a 60%. Para demanda erratic com alta variabilidade natural, nenhuma estrutura de modelo paramétrico melhora significativamente a previsão pontual — o que motiva deslocar o esforço para políticas de estoque mais robustas (tratado em Bloco 4).</w:t>
       </w:r>
     </w:p>
@@ -1741,26 +2016,37 @@
       <w:pPr>
         <w:spacing w:after="120"/>
         <w:jc w:val="both"/>
+        <w:rPr>
+          <w:lang w:val="pt-BR"/>
+        </w:rPr>
       </w:pPr>
       <w:r>
         <w:rPr>
           <w:b/>
+          <w:lang w:val="pt-BR"/>
         </w:rPr>
         <w:t xml:space="preserve">Implicação para estoque de segurança. </w:t>
       </w:r>
       <w:r>
+        <w:rPr>
+          <w:lang w:val="pt-BR"/>
+        </w:rPr>
         <w:t>Usando ES = z · RMSE · √LT com z = 1,645 (serviço 95%), F1-001 com H-W requer ~233 unidades (R$ 1.582), enquanto F2-003 requer ~89 unidades — porém a R$ 42/unidade, totaliza R$ 4.281. O erro de previsão tem custo real e assimétrico: modelo mais preciso significa menos capital parado sem perder serviço.</w:t>
       </w:r>
     </w:p>
     <w:p>
       <w:pPr>
         <w:spacing w:before="280" w:after="120"/>
+        <w:rPr>
+          <w:lang w:val="pt-BR"/>
+        </w:rPr>
       </w:pPr>
       <w:r>
         <w:rPr>
           <w:b/>
           <w:color w:val="1E4682"/>
           <w:sz w:val="32"/>
+          <w:lang w:val="pt-BR"/>
         </w:rPr>
         <w:lastRenderedPageBreak/>
         <w:t>Q5. Falhas de Dados e Processos</w:t>
@@ -1770,8 +2056,14 @@
       <w:pPr>
         <w:spacing w:after="120"/>
         <w:jc w:val="both"/>
+        <w:rPr>
+          <w:lang w:val="pt-BR"/>
+        </w:rPr>
       </w:pPr>
       <w:r>
+        <w:rPr>
+          <w:lang w:val="pt-BR"/>
+        </w:rPr>
         <w:t>Listamos abaixo as cinco falhas críticas que distorcem a previsão e o dimensionamento de estoques, cada uma com evidência quantitativa e mecanismo de impacto consolidado.</w:t>
       </w:r>
     </w:p>
@@ -1779,14 +2071,21 @@
       <w:pPr>
         <w:spacing w:after="120"/>
         <w:jc w:val="both"/>
+        <w:rPr>
+          <w:lang w:val="pt-BR"/>
+        </w:rPr>
       </w:pPr>
       <w:r>
         <w:rPr>
           <w:b/>
+          <w:lang w:val="pt-BR"/>
         </w:rPr>
         <w:t xml:space="preserve">Falha 1 — Cadastro incompleto (P6). </w:t>
       </w:r>
       <w:r>
+        <w:rPr>
+          <w:lang w:val="pt-BR"/>
+        </w:rPr>
         <w:t>12% dos SKUs sem EAN válido e hierarquia produto-família-canal incompleta. Impacto: a série de demanda captura apenas ~88% do volume real; em F2 (5 SKUs), um SKU omitido representa 20% da família. Modelos subestimam sistematicamente e a classificação ABC/XYZ fica inviável — F1-001, que representa 32% de F1, não é priorizado.</w:t>
       </w:r>
     </w:p>
@@ -1794,14 +2093,21 @@
       <w:pPr>
         <w:spacing w:after="120"/>
         <w:jc w:val="both"/>
+        <w:rPr>
+          <w:lang w:val="pt-BR"/>
+        </w:rPr>
       </w:pPr>
       <w:r>
         <w:rPr>
           <w:b/>
+          <w:lang w:val="pt-BR"/>
         </w:rPr>
         <w:t xml:space="preserve">Falha 2 — WMS com 8% de falhas de baixa (P6). </w:t>
       </w:r>
       <w:r>
+        <w:rPr>
+          <w:lang w:val="pt-BR"/>
+        </w:rPr>
         <w:t>8% das operações registram saída incorreta, exigindo 120 h/mês de recontagem. Impacto: histórico de demanda contaminado por viés acumulado em 104 semanas; saldo sistêmico divergente aciona pedido emergencial (R$ 1.250 + 42 kg CO₂), consumindo cota ESG em correções que não são ruptura real.</w:t>
       </w:r>
     </w:p>
@@ -1809,14 +2115,21 @@
       <w:pPr>
         <w:spacing w:after="120"/>
         <w:jc w:val="both"/>
+        <w:rPr>
+          <w:lang w:val="pt-BR"/>
+        </w:rPr>
       </w:pPr>
       <w:r>
         <w:rPr>
           <w:b/>
+          <w:lang w:val="pt-BR"/>
         </w:rPr>
         <w:t xml:space="preserve">Falha 3 — Delay de 4h entre e-commerce e ERP (P5). </w:t>
       </w:r>
       <w:r>
+        <w:rPr>
+          <w:lang w:val="pt-BR"/>
+        </w:rPr>
         <w:t>6% de cancelamento por indisponibilidade. Impacto: pedido registrado mas não atendido vira 'demanda fantasma' no histórico; para F1 (2.800 un/semana), estimam-se ~25 un/semana fictícias que, com shelf life de 7 dias, alimentam descarte. NPS online (32) colapsado frente à loja física (68).</w:t>
       </w:r>
     </w:p>
@@ -1824,14 +2137,21 @@
       <w:pPr>
         <w:spacing w:after="120"/>
         <w:jc w:val="both"/>
+        <w:rPr>
+          <w:lang w:val="pt-BR"/>
+        </w:rPr>
       </w:pPr>
       <w:r>
         <w:rPr>
           <w:b/>
+          <w:lang w:val="pt-BR"/>
         </w:rPr>
         <w:t xml:space="preserve">Falha 4 — Canais sem segmentação (P5). </w:t>
       </w:r>
       <w:r>
+        <w:rPr>
+          <w:lang w:val="pt-BR"/>
+        </w:rPr>
         <w:t>Todos os canais tratados como vendas genéricas. Impacto: média ponderada mascara dinâmicas opostas (marketplace +30% compensando loja −5% gera agregado +1%); e-commerce tem tolerância zero a ruptura visível, loja permite substituição — política única sub-protege o digital.</w:t>
       </w:r>
     </w:p>
@@ -1839,26 +2159,55 @@
       <w:pPr>
         <w:spacing w:after="120"/>
         <w:jc w:val="both"/>
+        <w:rPr>
+          <w:lang w:val="pt-BR"/>
+        </w:rPr>
       </w:pPr>
       <w:r>
         <w:rPr>
           <w:b/>
+          <w:lang w:val="pt-BR"/>
         </w:rPr>
         <w:t xml:space="preserve">Falha 5 — Promoções não registradas no histórico (P1/P3). </w:t>
       </w:r>
       <w:r>
-        <w:t>Sem flag no ERP e sem comunicação prévia estruturada. Impacto: picos são interpretados como variabilidade natural, inflando σ; como ES = z · σ · √LT, o estoque de segurança fica superdimensionado em regime permanente. A promoção de F2 na semana 30 (+55%) é o exemplo canônico: sem registro, modelos futuros tratarão o evento como outlier.</w:t>
+        <w:rPr>
+          <w:lang w:val="pt-BR"/>
+        </w:rPr>
+        <w:t xml:space="preserve">Sem flag no ERP e sem comunicação prévia estruturada. Impacto: picos são interpretados como variabilidade natural, inflando </w:t>
+      </w:r>
+      <w:r>
+        <w:t>σ</w:t>
+      </w:r>
+      <w:r>
+        <w:rPr>
+          <w:lang w:val="pt-BR"/>
+        </w:rPr>
+        <w:t xml:space="preserve">; como ES = z · </w:t>
+      </w:r>
+      <w:r>
+        <w:t>σ</w:t>
+      </w:r>
+      <w:r>
+        <w:rPr>
+          <w:lang w:val="pt-BR"/>
+        </w:rPr>
+        <w:t xml:space="preserve"> · √LT, o estoque de segurança fica superdimensionado em regime permanente. A promoção de F2 na semana 30 (+55%) é o exemplo canônico: sem registro, modelos futuros tratarão o evento como outlier.</w:t>
       </w:r>
     </w:p>
     <w:p>
       <w:pPr>
         <w:spacing w:before="280" w:after="120"/>
+        <w:rPr>
+          <w:lang w:val="pt-BR"/>
+        </w:rPr>
       </w:pPr>
       <w:r>
         <w:rPr>
           <w:b/>
           <w:color w:val="1E4682"/>
           <w:sz w:val="32"/>
+          <w:lang w:val="pt-BR"/>
         </w:rPr>
         <w:t>Q6. Roteiro de Visita</w:t>
       </w:r>
@@ -1869,7 +2218,42 @@
         <w:jc w:val="both"/>
       </w:pPr>
       <w:r>
-        <w:t>Oito perguntas direcionadas aos personagens-chave para validar ou refutar hipóteses sobre as causas dos problemas. Objetivo: capturar evidências quantitativas (KPIs, exceções, volumes de urgência).</w:t>
+        <w:rPr>
+          <w:lang w:val="pt-BR"/>
+        </w:rPr>
+        <w:t xml:space="preserve">Oito perguntas direcionadas aos personagens-chave para validar ou refutar hipóteses sobre as causas dos problemas. </w:t>
+      </w:r>
+      <w:proofErr w:type="spellStart"/>
+      <w:r>
+        <w:t>Objetivo</w:t>
+      </w:r>
+      <w:proofErr w:type="spellEnd"/>
+      <w:r>
+        <w:t xml:space="preserve">: </w:t>
+      </w:r>
+      <w:proofErr w:type="spellStart"/>
+      <w:r>
+        <w:t>capturar</w:t>
+      </w:r>
+      <w:proofErr w:type="spellEnd"/>
+      <w:r>
+        <w:t xml:space="preserve"> </w:t>
+      </w:r>
+      <w:proofErr w:type="spellStart"/>
+      <w:r>
+        <w:t>evidências</w:t>
+      </w:r>
+      <w:proofErr w:type="spellEnd"/>
+      <w:r>
+        <w:t xml:space="preserve"> </w:t>
+      </w:r>
+      <w:proofErr w:type="spellStart"/>
+      <w:r>
+        <w:t>quantitativas</w:t>
+      </w:r>
+      <w:proofErr w:type="spellEnd"/>
+      <w:r>
+        <w:t xml:space="preserve"> (KPIs, exceções, volumes de urgência).</w:t>
       </w:r>
     </w:p>
     <w:tbl>
@@ -2053,8 +2437,51 @@
             <w:r>
               <w:rPr>
                 <w:sz w:val="19"/>
-              </w:rPr>
-              <w:t>Na previsão semanal, qual é o dado bruto — pedidos, vendas faturadas ou saídas do WMS? Existe sinalização de promoções?</w:t>
+                <w:lang w:val="pt-BR"/>
+              </w:rPr>
+              <w:t xml:space="preserve">Na previsão semanal, qual é o dado bruto — pedidos, vendas faturadas ou saídas do WMS? </w:t>
+            </w:r>
+            <w:proofErr w:type="spellStart"/>
+            <w:r>
+              <w:rPr>
+                <w:sz w:val="19"/>
+              </w:rPr>
+              <w:t>Existe</w:t>
+            </w:r>
+            <w:proofErr w:type="spellEnd"/>
+            <w:r>
+              <w:rPr>
+                <w:sz w:val="19"/>
+              </w:rPr>
+              <w:t xml:space="preserve"> </w:t>
+            </w:r>
+            <w:proofErr w:type="spellStart"/>
+            <w:r>
+              <w:rPr>
+                <w:sz w:val="19"/>
+              </w:rPr>
+              <w:t>sinalização</w:t>
+            </w:r>
+            <w:proofErr w:type="spellEnd"/>
+            <w:r>
+              <w:rPr>
+                <w:sz w:val="19"/>
+              </w:rPr>
+              <w:t xml:space="preserve"> de </w:t>
+            </w:r>
+            <w:proofErr w:type="spellStart"/>
+            <w:r>
+              <w:rPr>
+                <w:sz w:val="19"/>
+              </w:rPr>
+              <w:t>promoções</w:t>
+            </w:r>
+            <w:proofErr w:type="spellEnd"/>
+            <w:r>
+              <w:rPr>
+                <w:sz w:val="19"/>
+              </w:rPr>
+              <w:t>?</w:t>
             </w:r>
           </w:p>
         </w:tc>
@@ -2070,9 +2497,15 @@
             <w:vAlign w:val="center"/>
           </w:tcPr>
           <w:p>
-            <w:r>
-              <w:rPr>
-                <w:sz w:val="19"/>
+            <w:pPr>
+              <w:rPr>
+                <w:lang w:val="pt-BR"/>
+              </w:rPr>
+            </w:pPr>
+            <w:r>
+              <w:rPr>
+                <w:sz w:val="19"/>
+                <w:lang w:val="pt-BR"/>
               </w:rPr>
               <w:t>Previsão sobre dados contaminados e sem flags de eventos explica MAPE &gt; 25%.</w:t>
             </w:r>
@@ -2138,9 +2571,15 @@
             <w:vAlign w:val="center"/>
           </w:tcPr>
           <w:p>
-            <w:r>
-              <w:rPr>
-                <w:sz w:val="19"/>
+            <w:pPr>
+              <w:rPr>
+                <w:lang w:val="pt-BR"/>
+              </w:rPr>
+            </w:pPr>
+            <w:r>
+              <w:rPr>
+                <w:sz w:val="19"/>
+                <w:lang w:val="pt-BR"/>
               </w:rPr>
               <w:t>Nas últimas 4 recontagens semanais, quais famílias têm maior divergência físico vs. sistêmico?</w:t>
             </w:r>
@@ -2159,9 +2598,15 @@
             <w:vAlign w:val="center"/>
           </w:tcPr>
           <w:p>
-            <w:r>
-              <w:rPr>
-                <w:sz w:val="19"/>
+            <w:pPr>
+              <w:rPr>
+                <w:lang w:val="pt-BR"/>
+              </w:rPr>
+            </w:pPr>
+            <w:r>
+              <w:rPr>
+                <w:sz w:val="19"/>
+                <w:lang w:val="pt-BR"/>
               </w:rPr>
               <w:t>Falhas de 8% do WMS concentradas em famílias específicas (F1, F5).</w:t>
             </w:r>
@@ -2227,8 +2672,51 @@
             <w:r>
               <w:rPr>
                 <w:sz w:val="19"/>
-              </w:rPr>
-              <w:t>Quantas viagens emergenciais nos últimos 3 meses, por semana? Motivo de cada uma?</w:t>
+                <w:lang w:val="pt-BR"/>
+              </w:rPr>
+              <w:t xml:space="preserve">Quantas viagens emergenciais nos últimos 3 meses, por semana? </w:t>
+            </w:r>
+            <w:proofErr w:type="spellStart"/>
+            <w:r>
+              <w:rPr>
+                <w:sz w:val="19"/>
+              </w:rPr>
+              <w:t>Motivo</w:t>
+            </w:r>
+            <w:proofErr w:type="spellEnd"/>
+            <w:r>
+              <w:rPr>
+                <w:sz w:val="19"/>
+              </w:rPr>
+              <w:t xml:space="preserve"> de </w:t>
+            </w:r>
+            <w:proofErr w:type="spellStart"/>
+            <w:r>
+              <w:rPr>
+                <w:sz w:val="19"/>
+              </w:rPr>
+              <w:t>cada</w:t>
+            </w:r>
+            <w:proofErr w:type="spellEnd"/>
+            <w:r>
+              <w:rPr>
+                <w:sz w:val="19"/>
+              </w:rPr>
+              <w:t xml:space="preserve"> </w:t>
+            </w:r>
+            <w:proofErr w:type="spellStart"/>
+            <w:r>
+              <w:rPr>
+                <w:sz w:val="19"/>
+              </w:rPr>
+              <w:t>uma</w:t>
+            </w:r>
+            <w:proofErr w:type="spellEnd"/>
+            <w:r>
+              <w:rPr>
+                <w:sz w:val="19"/>
+              </w:rPr>
+              <w:t>?</w:t>
             </w:r>
           </w:p>
         </w:tc>
@@ -2244,9 +2732,15 @@
             <w:vAlign w:val="center"/>
           </w:tcPr>
           <w:p>
-            <w:r>
-              <w:rPr>
-                <w:sz w:val="19"/>
+            <w:pPr>
+              <w:rPr>
+                <w:lang w:val="pt-BR"/>
+              </w:rPr>
+            </w:pPr>
+            <w:r>
+              <w:rPr>
+                <w:sz w:val="19"/>
+                <w:lang w:val="pt-BR"/>
               </w:rPr>
               <w:t>Maioria das 14-18 viagens/mês causada por falhas de processo, não por demanda imprevisível.</w:t>
             </w:r>
@@ -2315,8 +2809,37 @@
             <w:r>
               <w:rPr>
                 <w:sz w:val="19"/>
-              </w:rPr>
-              <w:t>Nas últimas 10 promoções, com quantos dias Operações foi notificada? Há registro formal?</w:t>
+                <w:lang w:val="pt-BR"/>
+              </w:rPr>
+              <w:t xml:space="preserve">Nas últimas 10 promoções, com quantos dias Operações foi notificada? </w:t>
+            </w:r>
+            <w:proofErr w:type="spellStart"/>
+            <w:r>
+              <w:rPr>
+                <w:sz w:val="19"/>
+              </w:rPr>
+              <w:t>Há</w:t>
+            </w:r>
+            <w:proofErr w:type="spellEnd"/>
+            <w:r>
+              <w:rPr>
+                <w:sz w:val="19"/>
+              </w:rPr>
+              <w:t xml:space="preserve"> </w:t>
+            </w:r>
+            <w:proofErr w:type="spellStart"/>
+            <w:r>
+              <w:rPr>
+                <w:sz w:val="19"/>
+              </w:rPr>
+              <w:t>registro</w:t>
+            </w:r>
+            <w:proofErr w:type="spellEnd"/>
+            <w:r>
+              <w:rPr>
+                <w:sz w:val="19"/>
+              </w:rPr>
+              <w:t xml:space="preserve"> formal?</w:t>
             </w:r>
           </w:p>
         </w:tc>
@@ -2333,9 +2856,15 @@
             <w:vAlign w:val="center"/>
           </w:tcPr>
           <w:p>
-            <w:r>
-              <w:rPr>
-                <w:sz w:val="19"/>
+            <w:pPr>
+              <w:rPr>
+                <w:lang w:val="pt-BR"/>
+              </w:rPr>
+            </w:pPr>
+            <w:r>
+              <w:rPr>
+                <w:sz w:val="19"/>
+                <w:lang w:val="pt-BR"/>
               </w:rPr>
               <w:t>Lead time de comunicação &lt; 7 dias e ausência de registro rastreável.</w:t>
             </w:r>
@@ -2398,9 +2927,15 @@
             <w:vAlign w:val="center"/>
           </w:tcPr>
           <w:p>
-            <w:r>
-              <w:rPr>
-                <w:sz w:val="19"/>
+            <w:pPr>
+              <w:rPr>
+                <w:lang w:val="pt-BR"/>
+              </w:rPr>
+            </w:pPr>
+            <w:r>
+              <w:rPr>
+                <w:sz w:val="19"/>
+                <w:lang w:val="pt-BR"/>
               </w:rPr>
               <w:t>Em crise de ruptura, qual é o fluxo de decisão? Quem autoriza viagem extra? Há protocolo?</w:t>
             </w:r>
@@ -2418,9 +2953,15 @@
             <w:vAlign w:val="center"/>
           </w:tcPr>
           <w:p>
-            <w:r>
-              <w:rPr>
-                <w:sz w:val="19"/>
+            <w:pPr>
+              <w:rPr>
+                <w:lang w:val="pt-BR"/>
+              </w:rPr>
+            </w:pPr>
+            <w:r>
+              <w:rPr>
+                <w:sz w:val="19"/>
+                <w:lang w:val="pt-BR"/>
               </w:rPr>
               <w:t>Ausência de S&amp;OE formal; decisões reativas, sem critérios e sem análise post-mortem.</w:t>
             </w:r>
@@ -2448,6 +2989,7 @@
               <w:rPr>
                 <w:sz w:val="19"/>
               </w:rPr>
+              <w:lastRenderedPageBreak/>
               <w:t>6</w:t>
             </w:r>
           </w:p>
@@ -2486,18 +3028,17 @@
             <w:vAlign w:val="center"/>
           </w:tcPr>
           <w:p>
-            <w:r>
-              <w:rPr>
-                <w:sz w:val="19"/>
-              </w:rPr>
-              <w:t xml:space="preserve">Existe erro de previsão por família e canal? Em quais </w:t>
-            </w:r>
-            <w:r>
-              <w:rPr>
-                <w:sz w:val="19"/>
-              </w:rPr>
-              <w:lastRenderedPageBreak/>
-              <w:t>semanas o erro foi maior?</w:t>
+            <w:pPr>
+              <w:rPr>
+                <w:lang w:val="pt-BR"/>
+              </w:rPr>
+            </w:pPr>
+            <w:r>
+              <w:rPr>
+                <w:sz w:val="19"/>
+                <w:lang w:val="pt-BR"/>
+              </w:rPr>
+              <w:t>Existe erro de previsão por família e canal? Em quais semanas o erro foi maior?</w:t>
             </w:r>
           </w:p>
         </w:tc>
@@ -2514,19 +3055,17 @@
             <w:vAlign w:val="center"/>
           </w:tcPr>
           <w:p>
-            <w:r>
-              <w:rPr>
-                <w:sz w:val="19"/>
-              </w:rPr>
-              <w:lastRenderedPageBreak/>
-              <w:t xml:space="preserve">Erro concentrado em eventos e famílias de alta variabilidade (F2, F4, </w:t>
-            </w:r>
-            <w:r>
-              <w:rPr>
-                <w:sz w:val="19"/>
-              </w:rPr>
-              <w:lastRenderedPageBreak/>
-              <w:t>F5).</w:t>
+            <w:pPr>
+              <w:rPr>
+                <w:lang w:val="pt-BR"/>
+              </w:rPr>
+            </w:pPr>
+            <w:r>
+              <w:rPr>
+                <w:sz w:val="19"/>
+                <w:lang w:val="pt-BR"/>
+              </w:rPr>
+              <w:t>Erro concentrado em eventos e famílias de alta variabilidade (F2, F4, F5).</w:t>
             </w:r>
           </w:p>
         </w:tc>
@@ -2551,7 +3090,6 @@
               <w:rPr>
                 <w:sz w:val="19"/>
               </w:rPr>
-              <w:lastRenderedPageBreak/>
               <w:t>7</w:t>
             </w:r>
           </w:p>
@@ -2591,8 +3129,37 @@
             <w:r>
               <w:rPr>
                 <w:sz w:val="19"/>
-              </w:rPr>
-              <w:t>Qual proporção de emissões vem de viagens programadas vs. emergenciais? Descarte piorando?</w:t>
+                <w:lang w:val="pt-BR"/>
+              </w:rPr>
+              <w:t xml:space="preserve">Qual proporção de emissões vem de viagens programadas vs. emergenciais? </w:t>
+            </w:r>
+            <w:proofErr w:type="spellStart"/>
+            <w:r>
+              <w:rPr>
+                <w:sz w:val="19"/>
+              </w:rPr>
+              <w:t>Descarte</w:t>
+            </w:r>
+            <w:proofErr w:type="spellEnd"/>
+            <w:r>
+              <w:rPr>
+                <w:sz w:val="19"/>
+              </w:rPr>
+              <w:t xml:space="preserve"> </w:t>
+            </w:r>
+            <w:proofErr w:type="spellStart"/>
+            <w:r>
+              <w:rPr>
+                <w:sz w:val="19"/>
+              </w:rPr>
+              <w:t>piorando</w:t>
+            </w:r>
+            <w:proofErr w:type="spellEnd"/>
+            <w:r>
+              <w:rPr>
+                <w:sz w:val="19"/>
+              </w:rPr>
+              <w:t>?</w:t>
             </w:r>
           </w:p>
         </w:tc>
@@ -2608,9 +3175,15 @@
             <w:vAlign w:val="center"/>
           </w:tcPr>
           <w:p>
-            <w:r>
-              <w:rPr>
-                <w:sz w:val="19"/>
+            <w:pPr>
+              <w:rPr>
+                <w:lang w:val="pt-BR"/>
+              </w:rPr>
+            </w:pPr>
+            <w:r>
+              <w:rPr>
+                <w:sz w:val="19"/>
+                <w:lang w:val="pt-BR"/>
               </w:rPr>
               <w:t>Viagens emergenciais dominam emissões evitáveis; descarte não melhora.</w:t>
             </w:r>
@@ -2676,9 +3249,15 @@
             <w:vAlign w:val="center"/>
           </w:tcPr>
           <w:p>
-            <w:r>
-              <w:rPr>
-                <w:sz w:val="19"/>
+            <w:pPr>
+              <w:rPr>
+                <w:lang w:val="pt-BR"/>
+              </w:rPr>
+            </w:pPr>
+            <w:r>
+              <w:rPr>
+                <w:sz w:val="19"/>
+                <w:lang w:val="pt-BR"/>
               </w:rPr>
               <w:t>Se pudesse mudar uma única coisa no planejamento, o que seria? O que te impede hoje?</w:t>
             </w:r>
@@ -2697,9 +3276,15 @@
             <w:vAlign w:val="center"/>
           </w:tcPr>
           <w:p>
-            <w:r>
-              <w:rPr>
-                <w:sz w:val="19"/>
+            <w:pPr>
+              <w:rPr>
+                <w:lang w:val="pt-BR"/>
+              </w:rPr>
+            </w:pPr>
+            <w:r>
+              <w:rPr>
+                <w:sz w:val="19"/>
+                <w:lang w:val="pt-BR"/>
               </w:rPr>
               <w:t>Captura perspectiva human-centric e barreiras culturais não-visíveis nos dados.</w:t>
             </w:r>
@@ -2710,17 +3295,24 @@
     <w:p>
       <w:pPr>
         <w:spacing w:after="80"/>
+        <w:rPr>
+          <w:lang w:val="pt-BR"/>
+        </w:rPr>
       </w:pPr>
     </w:p>
     <w:p>
       <w:pPr>
         <w:spacing w:before="280" w:after="120"/>
+        <w:rPr>
+          <w:lang w:val="pt-BR"/>
+        </w:rPr>
       </w:pPr>
       <w:r>
         <w:rPr>
           <w:b/>
           <w:color w:val="1E4682"/>
           <w:sz w:val="32"/>
+          <w:lang w:val="pt-BR"/>
         </w:rPr>
         <w:t>Q7. Diagnóstico Priorizado</w:t>
       </w:r>
@@ -2728,12 +3320,16 @@
     <w:p>
       <w:pPr>
         <w:spacing w:before="160" w:after="60"/>
+        <w:rPr>
+          <w:lang w:val="pt-BR"/>
+        </w:rPr>
       </w:pPr>
       <w:r>
         <w:rPr>
           <w:b/>
           <w:color w:val="3C3C3C"/>
           <w:sz w:val="24"/>
+          <w:lang w:val="pt-BR"/>
         </w:rPr>
         <w:t>Parte A — Diagnóstico Estruturado</w:t>
       </w:r>
@@ -2742,14 +3338,21 @@
       <w:pPr>
         <w:spacing w:after="120"/>
         <w:jc w:val="both"/>
+        <w:rPr>
+          <w:lang w:val="pt-BR"/>
+        </w:rPr>
       </w:pPr>
       <w:r>
         <w:rPr>
           <w:b/>
+          <w:lang w:val="pt-BR"/>
         </w:rPr>
         <w:t xml:space="preserve">(a) Problema central. </w:t>
       </w:r>
       <w:r>
+        <w:rPr>
+          <w:lang w:val="pt-BR"/>
+        </w:rPr>
         <w:t>A disfunção mais crítica é a ausência de planejamento diferenciado por perfil de produto: previsão genérica (média simples) e política uniforme (2 semanas fixas) aplicadas a cinco famílias radicalmente distintas. O ciclo vicioso resultante é: previsão imprecisa → estoque mal dimensionado → rupturas → viagens emergenciais → custo e emissões → equipe exausta → sem tempo para planejar → previsão continua imprecisa. No cenário em análise, agravado pelo aumento de 50% no lead time de F4 por 8 semanas e pela promoção de F2 (+55%) na semana 30, um sistema que não diferencia produtos será igualmente incapaz de responder a choques específicos.</w:t>
       </w:r>
     </w:p>
@@ -2757,14 +3360,21 @@
       <w:pPr>
         <w:spacing w:after="120"/>
         <w:jc w:val="both"/>
+        <w:rPr>
+          <w:lang w:val="pt-BR"/>
+        </w:rPr>
       </w:pPr>
       <w:r>
         <w:rPr>
           <w:b/>
+          <w:lang w:val="pt-BR"/>
         </w:rPr>
         <w:t xml:space="preserve">(b) Sintomas observáveis (24 meses, Anexo E). </w:t>
       </w:r>
       <w:r>
+        <w:rPr>
+          <w:lang w:val="pt-BR"/>
+        </w:rPr>
         <w:t>Fill rate médio 91,1%, com mínima de 84,0% em dezembro/2025 e 29% dos meses abaixo de 90%. Viagens emergenciais em média 14,2/mês (pico 21), totalizando ~R$ 17,8 mil/mês e 598 kg CO₂ — limite ESG de 15 viagens já é ultrapassado em cerca de metade dos meses. Descarte médio R$ 31,3 mil/mês (pico R$ 53,7 mil) com tendência de piora de +6,9% no último semestre; segundo P8, F1 concentra ~R$ 38 mil/mês. Horas extras no CD em crescimento de +24% entre primeiro e último semestre (122,7 h/mês em média). Cancelamento online médio 6,1% (pico 8,7%).</w:t>
       </w:r>
     </w:p>
@@ -2772,26 +3382,37 @@
       <w:pPr>
         <w:spacing w:after="120"/>
         <w:jc w:val="both"/>
+        <w:rPr>
+          <w:lang w:val="pt-BR"/>
+        </w:rPr>
       </w:pPr>
       <w:r>
         <w:rPr>
           <w:b/>
+          <w:lang w:val="pt-BR"/>
         </w:rPr>
         <w:t xml:space="preserve">(c) Causas-raiz em quatro camadas. </w:t>
       </w:r>
       <w:r>
+        <w:rPr>
+          <w:lang w:val="pt-BR"/>
+        </w:rPr>
         <w:t>Camada 1 — dados imperfeitos: cadastro (12% sem EAN), WMS (8% de falhas), delay de 4h do e-commerce. É pré-requisito para tudo. Camada 2 — sistemas desintegrados: ERP, WMS, TMS e e-commerce como silos, sem visão unificada e BI com 48h de atraso. Camada 3 — processos informais: sem S&amp;OE, decisões por WhatsApp, promoções sem aviso, sem ABC/XYZ. Camada 4 — governança frágil: sem fórum de trade-off, cada área otimiza isoladamente. As quatro camadas se retroalimentam e devem ser atacadas em paralelo, começando pela Camada 1 (quick wins de dados) que habilita as demais.</w:t>
       </w:r>
     </w:p>
     <w:p>
       <w:pPr>
         <w:spacing w:before="160" w:after="60"/>
+        <w:rPr>
+          <w:lang w:val="pt-BR"/>
+        </w:rPr>
       </w:pPr>
       <w:r>
         <w:rPr>
           <w:b/>
           <w:color w:val="3C3C3C"/>
           <w:sz w:val="24"/>
+          <w:lang w:val="pt-BR"/>
         </w:rPr>
         <w:t>Parte B — Plano de Experimentos de Previsão</w:t>
       </w:r>
@@ -2800,8 +3421,14 @@
       <w:pPr>
         <w:spacing w:after="120"/>
         <w:jc w:val="both"/>
+        <w:rPr>
+          <w:lang w:val="pt-BR"/>
+        </w:rPr>
       </w:pPr>
       <w:r>
+        <w:rPr>
+          <w:lang w:val="pt-BR"/>
+        </w:rPr>
         <w:t>Dados e partição: série de 104 semanas (Anexo D1); split treino (1-80) e teste (81-104). Modelos em complexidade crescente — Nível 1: Naive, MA(4); Nível 2: SES, Holt, Holt-Winters; Nível 3: ETS automático, ARIMA. Critério de seleção: menor RMSE com ganho &gt; 10% sobre o modelo mais simples; empate dentro de 5% → parcimônia.</w:t>
       </w:r>
     </w:p>
@@ -2809,26 +3436,37 @@
       <w:pPr>
         <w:spacing w:after="120"/>
         <w:jc w:val="both"/>
+        <w:rPr>
+          <w:lang w:val="pt-BR"/>
+        </w:rPr>
       </w:pPr>
       <w:r>
         <w:rPr>
           <w:b/>
+          <w:lang w:val="pt-BR"/>
         </w:rPr>
         <w:t xml:space="preserve">Achado metodológico importante. </w:t>
       </w:r>
       <w:r>
+        <w:rPr>
+          <w:lang w:val="pt-BR"/>
+        </w:rPr>
         <w:t>A classificação clássica de Syntetos-Boylan (ADI × CV²) aplicada à série observada classifica as cinco famílias como Smooth — porque a Vila Aurora tem séries praticamente sem semanas zeradas (ADI ≈ 1,00 para F1/F3/F4 e ≈ 1,02 para F2/F5, com no máximo 2 zeros em 104 semanas). Isso evidencia que o classificador clássico perde poder discriminante neste contexto. Adotamos uma classificação prática complementar baseada apenas em CV²: &lt; 0,15 = smooth puro (F1, F3, F4); ≥ 0,35 = erratic/lumpy (F2, F5). Essa distinção fundamenta as recomendações apresentadas em Q8.</w:t>
       </w:r>
     </w:p>
     <w:p>
       <w:pPr>
         <w:spacing w:before="280" w:after="120"/>
+        <w:rPr>
+          <w:lang w:val="pt-BR"/>
+        </w:rPr>
       </w:pPr>
       <w:r>
         <w:rPr>
           <w:b/>
           <w:color w:val="1E4682"/>
           <w:sz w:val="32"/>
+          <w:lang w:val="pt-BR"/>
         </w:rPr>
         <w:t>Q8. Recomendação de Modelo por Família</w:t>
       </w:r>
@@ -2837,8 +3475,14 @@
       <w:pPr>
         <w:spacing w:after="120"/>
         <w:jc w:val="both"/>
+        <w:rPr>
+          <w:lang w:val="pt-BR"/>
+        </w:rPr>
       </w:pPr>
       <w:r>
+        <w:rPr>
+          <w:lang w:val="pt-BR"/>
+        </w:rPr>
         <w:lastRenderedPageBreak/>
         <w:t>Executamos o plano definido em Q7 Parte B: sete modelos (Naive, MA(4), SES, Holt, Winters, ETS, ARIMA) sobre as cinco famílias, com 80/24 semanas de treino/teste e seleção por menor RMSE com critério de parcimônia (tolerância 5%). O script completo está em src/q8_classificacao_e_modelos.py.</w:t>
       </w:r>
@@ -2847,14 +3491,52 @@
       <w:pPr>
         <w:spacing w:before="160" w:after="60"/>
       </w:pPr>
+      <w:proofErr w:type="spellStart"/>
       <w:r>
         <w:rPr>
           <w:b/>
           <w:color w:val="3C3C3C"/>
           <w:sz w:val="24"/>
         </w:rPr>
-        <w:t>Perfil de demanda observado</w:t>
+        <w:t>Perfil</w:t>
       </w:r>
+      <w:proofErr w:type="spellEnd"/>
+      <w:r>
+        <w:rPr>
+          <w:b/>
+          <w:color w:val="3C3C3C"/>
+          <w:sz w:val="24"/>
+        </w:rPr>
+        <w:t xml:space="preserve"> de </w:t>
+      </w:r>
+      <w:proofErr w:type="spellStart"/>
+      <w:r>
+        <w:rPr>
+          <w:b/>
+          <w:color w:val="3C3C3C"/>
+          <w:sz w:val="24"/>
+        </w:rPr>
+        <w:t>demanda</w:t>
+      </w:r>
+      <w:proofErr w:type="spellEnd"/>
+      <w:r>
+        <w:rPr>
+          <w:b/>
+          <w:color w:val="3C3C3C"/>
+          <w:sz w:val="24"/>
+        </w:rPr>
+        <w:t xml:space="preserve"> </w:t>
+      </w:r>
+      <w:proofErr w:type="spellStart"/>
+      <w:r>
+        <w:rPr>
+          <w:b/>
+          <w:color w:val="3C3C3C"/>
+          <w:sz w:val="24"/>
+        </w:rPr>
+        <w:t>observado</w:t>
+      </w:r>
+      <w:proofErr w:type="spellEnd"/>
     </w:p>
     <w:p>
       <w:pPr>
@@ -2905,12 +3587,16 @@
       <w:pPr>
         <w:spacing w:after="160"/>
         <w:jc w:val="center"/>
+        <w:rPr>
+          <w:lang w:val="pt-BR"/>
+        </w:rPr>
       </w:pPr>
       <w:r>
         <w:rPr>
           <w:i/>
           <w:color w:val="5A5A5A"/>
           <w:sz w:val="18"/>
+          <w:lang w:val="pt-BR"/>
         </w:rPr>
         <w:t>Figura 2 — Posicionamento das 5 famílias no plano ADI × CV² (Syntetos-Boylan). Todas caem no quadrante Smooth pelos cortes clássicos (linhas tracejadas), mas F2 e F5 estão claramente separadas de F1/F3/F4 no eixo CV².</w:t>
       </w:r>
@@ -3926,12 +4612,16 @@
       <w:pPr>
         <w:spacing w:after="160"/>
         <w:jc w:val="center"/>
+        <w:rPr>
+          <w:lang w:val="pt-BR"/>
+        </w:rPr>
       </w:pPr>
       <w:r>
         <w:rPr>
           <w:i/>
           <w:color w:val="5A5A5A"/>
           <w:sz w:val="18"/>
+          <w:lang w:val="pt-BR"/>
         </w:rPr>
         <w:t>Figura 3 — RMSE de cada modelo como percentual acima do melhor por família. A estrela marca o melhor modelo em cada linha.</w:t>
       </w:r>
@@ -3940,28 +4630,72 @@
       <w:pPr>
         <w:spacing w:after="120"/>
         <w:jc w:val="both"/>
+        <w:rPr>
+          <w:lang w:val="pt-BR"/>
+        </w:rPr>
       </w:pPr>
       <w:r>
         <w:rPr>
           <w:b/>
+          <w:lang w:val="pt-BR"/>
         </w:rPr>
         <w:t xml:space="preserve">Análise por família. </w:t>
       </w:r>
       <w:r>
-        <w:t>Em F1 (smooth, volume alto), Winters ganha por margem estreita (RMSE 816 vs Naive 839, +3%); a parcimônia recomenda Naive. Em F2 (erratic), cinco modelos empatam em RMSE ~179 — complexidade não agrega; MA(4) vence por parcimônia. F3 é o caso onde complexidade realmente vale a pena: Winters (RMSE 503) supera Naive (746) em 33%, porque captura sazonalidade intra-anual estrutural. Em F4, Winters é o melhor absoluto (405), mas MA(4) fica a 1% — parcimônia novamente prevalece. Em F5 (lumpy), SES com α baixo suaviza o ruído e bate Naive em 45%.</w:t>
+        <w:rPr>
+          <w:lang w:val="pt-BR"/>
+        </w:rPr>
+        <w:t xml:space="preserve">Em F1 (smooth, volume alto), Winters ganha por margem estreita (RMSE 816 vs Naive 839, +3%); a parcimônia recomenda Naive. Em F2 (erratic), cinco modelos empatam em RMSE ~179 — complexidade não agrega; MA(4) vence por parcimônia. F3 é o caso onde complexidade realmente vale a pena: Winters (RMSE 503) supera Naive (746) em 33%, porque captura sazonalidade intra-anual estrutural. Em F4, Winters é o melhor absoluto (405), mas MA(4) fica a 1% — parcimônia novamente prevalece. Em F5 (lumpy), SES com </w:t>
+      </w:r>
+      <w:r>
+        <w:t>α</w:t>
+      </w:r>
+      <w:r>
+        <w:rPr>
+          <w:lang w:val="pt-BR"/>
+        </w:rPr>
+        <w:t xml:space="preserve"> baixo suaviza o ruído e bate Naive em 45%.</w:t>
       </w:r>
     </w:p>
     <w:p>
       <w:pPr>
         <w:spacing w:before="160" w:after="60"/>
       </w:pPr>
+      <w:proofErr w:type="spellStart"/>
       <w:r>
         <w:rPr>
           <w:b/>
           <w:color w:val="3C3C3C"/>
           <w:sz w:val="24"/>
         </w:rPr>
-        <w:t>Matriz de recomendação final</w:t>
+        <w:t>Matriz</w:t>
+      </w:r>
+      <w:proofErr w:type="spellEnd"/>
+      <w:r>
+        <w:rPr>
+          <w:b/>
+          <w:color w:val="3C3C3C"/>
+          <w:sz w:val="24"/>
+        </w:rPr>
+        <w:t xml:space="preserve"> de </w:t>
+      </w:r>
+      <w:proofErr w:type="spellStart"/>
+      <w:r>
+        <w:rPr>
+          <w:b/>
+          <w:color w:val="3C3C3C"/>
+          <w:sz w:val="24"/>
+        </w:rPr>
+        <w:t>recomendação</w:t>
+      </w:r>
+      <w:proofErr w:type="spellEnd"/>
+      <w:r>
+        <w:rPr>
+          <w:b/>
+          <w:color w:val="3C3C3C"/>
+          <w:sz w:val="24"/>
+        </w:rPr>
+        <w:t xml:space="preserve"> final</w:t>
       </w:r>
     </w:p>
     <w:tbl>
@@ -4787,14 +5521,21 @@
       <w:pPr>
         <w:spacing w:after="120"/>
         <w:jc w:val="both"/>
+        <w:rPr>
+          <w:lang w:val="pt-BR"/>
+        </w:rPr>
       </w:pPr>
       <w:r>
         <w:rPr>
           <w:b/>
+          <w:lang w:val="pt-BR"/>
         </w:rPr>
         <w:t xml:space="preserve">Implicação operacional. </w:t>
       </w:r>
       <w:r>
+        <w:rPr>
+          <w:lang w:val="pt-BR"/>
+        </w:rPr>
         <w:t>Apenas F3 justifica migração para Python/R — 80% do portfólio (em número de famílias) pode ser mantido em Excel, dispensando a contratação imediata de cientista de dados dedicado. F1 e F4 exigem ciclo semanal (shelf life curto e sensibilidade a choques); F2, F3 e F5 podem seguir cadência quinzenal, liberando tempo de planejamento para F3 (que é a família mais lucrativa em volume). Ressalva importante: para F4 a recomendação Naive é válida em curto prazo; a tendência estrutural de +3,5 un/semana² (Anexo A) exige revisão trimestral para evitar viés acumulado.</w:t>
       </w:r>
     </w:p>
@@ -4802,26 +5543,64 @@
       <w:pPr>
         <w:spacing w:after="120"/>
         <w:jc w:val="both"/>
+        <w:rPr>
+          <w:lang w:val="pt-BR"/>
+        </w:rPr>
       </w:pPr>
       <w:r>
         <w:rPr>
           <w:b/>
+          <w:lang w:val="pt-BR"/>
         </w:rPr>
         <w:t xml:space="preserve">Trade-off interpretabilidade vs. acurácia. </w:t>
       </w:r>
       <w:r>
-        <w:t>Naive, MA(4) e SES são transparentes para o time comercial e não exigem explicação estatística. Winters já demanda compreensão dos parâmetros α, β, γ e do conceito de sazonalidade aditiva — mas em F3 o ganho de 33% justifica o investimento em capacitação. ARIMA/ETS automáticos aparecem competitivos em algumas famílias, mas a 'caixa-preta' dificulta a defesa operacional.</w:t>
+        <w:rPr>
+          <w:lang w:val="pt-BR"/>
+        </w:rPr>
+        <w:t xml:space="preserve">Naive, MA(4) e SES são transparentes para o time comercial e não exigem explicação estatística. Winters já demanda compreensão dos parâmetros </w:t>
+      </w:r>
+      <w:r>
+        <w:t>α</w:t>
+      </w:r>
+      <w:r>
+        <w:rPr>
+          <w:lang w:val="pt-BR"/>
+        </w:rPr>
+        <w:t xml:space="preserve">, </w:t>
+      </w:r>
+      <w:r>
+        <w:t>β</w:t>
+      </w:r>
+      <w:r>
+        <w:rPr>
+          <w:lang w:val="pt-BR"/>
+        </w:rPr>
+        <w:t xml:space="preserve">, </w:t>
+      </w:r>
+      <w:r>
+        <w:t>γ</w:t>
+      </w:r>
+      <w:r>
+        <w:rPr>
+          <w:lang w:val="pt-BR"/>
+        </w:rPr>
+        <w:t xml:space="preserve"> e do conceito de sazonalidade aditiva — mas em F3 o ganho de 33% justifica o investimento em capacitação. ARIMA/ETS automáticos aparecem competitivos em algumas famílias, mas a 'caixa-preta' dificulta a defesa operacional.</w:t>
       </w:r>
     </w:p>
     <w:p>
       <w:pPr>
         <w:spacing w:before="280" w:after="120"/>
+        <w:rPr>
+          <w:lang w:val="pt-BR"/>
+        </w:rPr>
       </w:pPr>
       <w:r>
         <w:rPr>
           <w:b/>
           <w:color w:val="1E4682"/>
           <w:sz w:val="32"/>
+          <w:lang w:val="pt-BR"/>
         </w:rPr>
         <w:t>Q9. Da Previsão ao Impacto Operacional</w:t>
       </w:r>
@@ -4830,8 +5609,14 @@
       <w:pPr>
         <w:spacing w:after="120"/>
         <w:jc w:val="both"/>
+        <w:rPr>
+          <w:lang w:val="pt-BR"/>
+        </w:rPr>
       </w:pPr>
       <w:r>
+        <w:rPr>
+          <w:lang w:val="pt-BR"/>
+        </w:rPr>
         <w:lastRenderedPageBreak/>
         <w:t>Demonstramos aqui a cadeia causal completa: erro de previsão (RMSE) → estoque de segurança requerido → rupturas quando o ES é insuficiente → impacto em viagens extras, descarte e retrabalho. Escolhemos como par contrastante F1 (Perecíveis) e F2 (Premium) — não F1 × F3 como sugerido pelo enunciado — porque F1 e F3 são ambos smooth e o contraste ficaria limitado ao volume. F1 × F2 contrapõe smooth vs. erratic, shelf life curto vs. longo, LT curto vs. longo, volume alto vs. baixo e margem 35% vs. 45% — um contraste operacional genuíno e conectado ao cenário atribuído (que tem promoção em F2 na semana 30). Script em src/q9_cadeia_causal.py.</w:t>
       </w:r>
@@ -4839,12 +5624,16 @@
     <w:p>
       <w:pPr>
         <w:spacing w:before="160" w:after="60"/>
+        <w:rPr>
+          <w:lang w:val="pt-BR"/>
+        </w:rPr>
       </w:pPr>
       <w:r>
         <w:rPr>
           <w:b/>
           <w:color w:val="3C3C3C"/>
           <w:sz w:val="24"/>
+          <w:lang w:val="pt-BR"/>
         </w:rPr>
         <w:t>Metodologia</w:t>
       </w:r>
@@ -4853,8 +5642,14 @@
       <w:pPr>
         <w:spacing w:after="120"/>
         <w:jc w:val="both"/>
+        <w:rPr>
+          <w:lang w:val="pt-BR"/>
+        </w:rPr>
       </w:pPr>
       <w:r>
+        <w:rPr>
+          <w:lang w:val="pt-BR"/>
+        </w:rPr>
         <w:t>Usamos o melhor modelo identificado em Q8 para cada família (Holt-Winters para F1, SES para F2). O estoque de segurança é calculado como ES = z · RMSE · √LT, onde z corresponde ao nível de serviço alvo — 97% para F1 (alinhado ao KPI 1) e 90% para F2 (nível menor justificado pelo alto custo de manutenção, R$ 11/un/ano, e pela baixa recorrência típica do cliente premium). A simulação de rupturas é empírica: comparamos demanda real do período de teste contra previsão + ES, contando semanas com faltante. A propagação para impacto financeiro usa os parâmetros do Anexo G.</w:t>
       </w:r>
     </w:p>
@@ -4907,12 +5702,16 @@
       <w:pPr>
         <w:spacing w:after="160"/>
         <w:jc w:val="center"/>
+        <w:rPr>
+          <w:lang w:val="pt-BR"/>
+        </w:rPr>
       </w:pPr>
       <w:r>
         <w:rPr>
           <w:i/>
           <w:color w:val="5A5A5A"/>
           <w:sz w:val="18"/>
+          <w:lang w:val="pt-BR"/>
         </w:rPr>
         <w:t>Figura 4 — Cadeia causal lado a lado para F1 e F2, dos elos RMSE → ES → rupturas → impacto operacional. O período de teste cobre 24 semanas (81-104).</w:t>
       </w:r>
@@ -4920,12 +5719,16 @@
     <w:p>
       <w:pPr>
         <w:spacing w:before="160" w:after="60"/>
+        <w:rPr>
+          <w:lang w:val="pt-BR"/>
+        </w:rPr>
       </w:pPr>
       <w:r>
         <w:rPr>
           <w:b/>
           <w:color w:val="3C3C3C"/>
           <w:sz w:val="24"/>
+          <w:lang w:val="pt-BR"/>
         </w:rPr>
         <w:t>Resultados no período de teste</w:t>
       </w:r>
@@ -5372,8 +6175,14 @@
       <w:pPr>
         <w:spacing w:after="80"/>
         <w:jc w:val="both"/>
+        <w:rPr>
+          <w:lang w:val="pt-BR"/>
+        </w:rPr>
       </w:pPr>
       <w:r>
+        <w:rPr>
+          <w:lang w:val="pt-BR"/>
+        </w:rPr>
         <w:t>Propagando para o período de teste (24 semanas) a simulação empírica de rupturas e os custos do Anexo G, obtemos:</w:t>
       </w:r>
     </w:p>
@@ -5780,9 +6589,15 @@
             <w:vAlign w:val="center"/>
           </w:tcPr>
           <w:p>
-            <w:r>
-              <w:rPr>
-                <w:sz w:val="19"/>
+            <w:pPr>
+              <w:rPr>
+                <w:lang w:val="pt-BR"/>
+              </w:rPr>
+            </w:pPr>
+            <w:r>
+              <w:rPr>
+                <w:sz w:val="19"/>
+                <w:lang w:val="pt-BR"/>
               </w:rPr>
               <w:t>0 (LT de 14d inviabiliza emergência)</w:t>
             </w:r>
@@ -5820,14 +6635,21 @@
       <w:pPr>
         <w:spacing w:after="120"/>
         <w:jc w:val="both"/>
+        <w:rPr>
+          <w:lang w:val="pt-BR"/>
+        </w:rPr>
       </w:pPr>
       <w:r>
         <w:rPr>
           <w:b/>
+          <w:lang w:val="pt-BR"/>
         </w:rPr>
         <w:t xml:space="preserve">Leitura contrastante. </w:t>
       </w:r>
       <w:r>
+        <w:rPr>
+          <w:lang w:val="pt-BR"/>
+        </w:rPr>
         <w:t>F1 tem RMSE alto em valor absoluto (816 un/semana), mas seu LT curto (2 dias = 0,29 semana) compensa: ES = 1,88 · 816 · √0,29 ≈ 821 unidades, que corresponde a apenas ~27% da demanda média semanal. Mesmo assim, 4 das 24 semanas do teste apresentam ruptura (16,7%), e o fill rate simulado cai para 95% — abaixo do alvo de 97%. A razão é que o H-W não captura perfeitamente picos promocionais do período de teste, e a distribuição normal implícita no z subestima caudas. F2 tem cenário oposto: RMSE absoluto menor (179), mas LT longo (14 dias = 2 semanas) amplifica: ES = 1,28 · 179 · √2 ≈ 325 unidades, que é quase 100% da demanda média. Com ES relativamente robusto, apenas 1 semana registra ruptura (4,2%), e o fill rate simulado fica em 97% — acima do alvo de 90%.</w:t>
       </w:r>
     </w:p>
@@ -5835,14 +6657,21 @@
       <w:pPr>
         <w:spacing w:after="120"/>
         <w:jc w:val="both"/>
+        <w:rPr>
+          <w:lang w:val="pt-BR"/>
+        </w:rPr>
       </w:pPr>
       <w:r>
         <w:rPr>
           <w:b/>
+          <w:lang w:val="pt-BR"/>
         </w:rPr>
         <w:t xml:space="preserve">Impacto operacional assimétrico. </w:t>
       </w:r>
       <w:r>
+        <w:rPr>
+          <w:lang w:val="pt-BR"/>
+        </w:rPr>
         <w:t>Em F1, cada semana com ruptura gera uma viagem emergencial (LT curto permite remediar em 2 dias), totalizando 4 viagens no teste (R$ 5.000 + 168 kg CO₂) — e o descarte estimado de ~R$ 8 mil decorre de superprevisões que encontram produto com 7 dias de shelf life. Em F2, nenhuma viagem extra é viável: com LT de 14 dias do importador, a ruptura vira integralmente venda perdida — mas a R$ 42 de custo unitário e 45% de margem, mesmo 1 semana perdida custa R$ 15,3 mil em receita não realizada.</w:t>
       </w:r>
     </w:p>
@@ -5895,12 +6724,16 @@
       <w:pPr>
         <w:spacing w:after="160"/>
         <w:jc w:val="center"/>
+        <w:rPr>
+          <w:lang w:val="pt-BR"/>
+        </w:rPr>
       </w:pPr>
       <w:r>
         <w:rPr>
           <w:i/>
           <w:color w:val="5A5A5A"/>
           <w:sz w:val="18"/>
+          <w:lang w:val="pt-BR"/>
         </w:rPr>
         <w:t>Figura 5 — Projeção anual do custo de falhas de previsão (esquerda) e comparação entre o estoque de segurança da política atual (2 semanas fixas) e o recomendado (z · RMSE · √LT) (direita).</w:t>
       </w:r>
@@ -5909,14 +6742,21 @@
       <w:pPr>
         <w:spacing w:after="120"/>
         <w:jc w:val="both"/>
+        <w:rPr>
+          <w:lang w:val="pt-BR"/>
+        </w:rPr>
       </w:pPr>
       <w:r>
         <w:rPr>
           <w:b/>
+          <w:lang w:val="pt-BR"/>
         </w:rPr>
         <w:t xml:space="preserve">Projeção anual. </w:t>
       </w:r>
       <w:r>
+        <w:rPr>
+          <w:lang w:val="pt-BR"/>
+        </w:rPr>
         <w:t>Escalando os 24 semanas de teste para 52 semanas, F1 custa R$ 209 mil/ano em falhas de previsão (R$ 95 mil em venda perdida + R$ 86 mil em custo operacional de ruptura + R$ 17 mil em descarte + R$ 11 mil em viagens) e F2 custa R$ 69 mil/ano (apenas venda perdida e custo de ruptura, sem viagens nem descarte). Esse valor é um piso, não um teto — representa o custo com o modelo recomendado; a situação real da Vila Aurora, que usa média móvel genérica, tende a ser pior.</w:t>
       </w:r>
     </w:p>
@@ -5924,26 +6764,37 @@
       <w:pPr>
         <w:spacing w:after="120"/>
         <w:jc w:val="both"/>
+        <w:rPr>
+          <w:lang w:val="pt-BR"/>
+        </w:rPr>
       </w:pPr>
       <w:r>
         <w:rPr>
           <w:b/>
+          <w:lang w:val="pt-BR"/>
         </w:rPr>
         <w:t xml:space="preserve">Dimensionamento absurdo da política atual. </w:t>
       </w:r>
       <w:r>
+        <w:rPr>
+          <w:lang w:val="pt-BR"/>
+        </w:rPr>
         <w:t>A regra vigente de 2 semanas fixas de cobertura produz ES de 6.054 unidades em F1 e 628 em F2. A política recomendada é 821 e 325 respectivamente — ou seja, a política atual superdimensiona o ES em 86% em F1 e 48% em F2. O capital parado desnecessário em F1 é de aproximadamente 5.230 unidades extras × R$ 8,50 = R$ 44 mil, com impacto direto em descarte (o produto não sobrevive às 2 semanas de cobertura em shelf life de 7 dias).</w:t>
       </w:r>
     </w:p>
     <w:p>
       <w:pPr>
         <w:spacing w:before="280" w:after="120"/>
+        <w:rPr>
+          <w:lang w:val="pt-BR"/>
+        </w:rPr>
       </w:pPr>
       <w:r>
         <w:rPr>
           <w:b/>
           <w:color w:val="1E4682"/>
           <w:sz w:val="32"/>
+          <w:lang w:val="pt-BR"/>
         </w:rPr>
         <w:t>Conclusão e Próximos Passos</w:t>
       </w:r>
@@ -5952,21 +6803,36 @@
       <w:pPr>
         <w:spacing w:after="120"/>
         <w:jc w:val="both"/>
+        <w:rPr>
+          <w:lang w:val="pt-BR"/>
+        </w:rPr>
       </w:pPr>
       <w:r>
-        <w:t xml:space="preserve">A Vila Aurora apresenta disfunção estrutural em quatro camadas — dados, sistemas, processos e governança — que se retroalimentam. O diagnóstico quantitativo confirma: fill rate médio de 91%, 14 viagens emergenciais/mês, descarte crescente de R$ 31 mil/mês e horas-extras em alta. O caminho de transformação </w:t>
+        <w:rPr>
+          <w:lang w:val="pt-BR"/>
+        </w:rPr>
+        <w:t xml:space="preserve">A Vila Aurora apresenta disfunção estrutural em quatro camadas — dados, sistemas, processos e governança — que se retroalimentam. O diagnóstico quantitativo confirma: fill rate médio de 91%, 14 viagens emergenciais/mês, descarte crescente de R$ 31 mil/mês e horas-extras em alta. O caminho de transformação começa por previsão </w:t>
       </w:r>
       <w:r>
+        <w:rPr>
+          <w:lang w:val="pt-BR"/>
+        </w:rPr>
         <w:lastRenderedPageBreak/>
-        <w:t>começa por previsão diferenciada por família: o benchmark de sete modelos sobre as cinco famílias mostra que 80% do portfólio pode ser mantido em Excel com modelos simples, enquanto F3 justifica migração para ferramenta dedicada e oferece ganho de acurácia de 33%. A cadeia causal F1 × F2 quantifica o custo das falhas em R$ 278 mil/ano combinados, apenas nas duas famílias analisadas — e revela que a política atual de estoque superdimensiona ES em 48-86%.</w:t>
+        <w:t>diferenciada por família: o benchmark de sete modelos sobre as cinco famílias mostra que 80% do portfólio pode ser mantido em Excel com modelos simples, enquanto F3 justifica migração para ferramenta dedicada e oferece ganho de acurácia de 33%. A cadeia causal F1 × F2 quantifica o custo das falhas em R$ 278 mil/ano combinados, apenas nas duas famílias analisadas — e revela que a política atual de estoque superdimensiona ES em 48-86%.</w:t>
       </w:r>
     </w:p>
     <w:p>
       <w:pPr>
         <w:spacing w:after="120"/>
         <w:jc w:val="both"/>
+        <w:rPr>
+          <w:lang w:val="pt-BR"/>
+        </w:rPr>
       </w:pPr>
       <w:r>
+        <w:rPr>
+          <w:lang w:val="pt-BR"/>
+        </w:rPr>
         <w:t>Os próximos blocos tratam de: (i) dilemas de trade-off explicitados com stakeholders e critérios de decisão (Q10); (ii) comparação de políticas de estoque sob cenários com choque e promoção (Q11); (iii) simulação Monte Carlo com fronteira eficiente custo × serviço × ESG (Q12); e (iv) desenho final de S&amp;OE com matriz de riscos, dashboard de semáforos e roadmap de 90 dias (Q13-Q15).</w:t>
       </w:r>
     </w:p>

</xml_diff>